<commit_message>
Add GRU results, refreshed attack/evaluate for all five models, regenerate documents
Bi-GRU: 92.9% accuracy, 88.1% obfuscated recall - below the CNN, so order
and long-range context do not beat convolution on this data.

Packet-space black-box attack on freshly generated malicious flows:
CNN 4.0% -> 14.1% evasion at 158% byte overhead; MLP 1.5% -> 9.1% at 8%;
GRU 4.5% -> 19.2% at 78%; hybrid 2.0% -> 10.1% at 78%; defended hybrid
2.0% -> 10.6% at 86%. Adversarial training does not carry over to this
attack even though it more than halves gradient-PGD evasion - the two
attacks take different paths, and a defense evaluated only against the
attack it was trained on would look far better than it is. Recorded in
FUTURE_WORK as the next defense experiment.

Five-way transfer matrix on a 1,000-flow subsample; defended hybrid holds
90-95% against examples crafted on any other model.

Report, book chapter and deck regenerated from the final numbers.
PROJECT.md gains a headline-results table.
</commit_message>
<xml_diff>
--- a/docs/ANTOD_book_chapter.docx
+++ b/docs/ANTOD_book_chapter.docx
@@ -1184,6 +1184,164 @@
                 <w:szCs w:val="20"/>
               </w:rPr>
               <w:t xml:space="preserve">0.0448</w:t>
+            </w:r>
+          </w:p>
+        </w:tc>
+      </w:tr>
+      <w:tr>
+        <w:tc>
+          <w:tcPr>
+            <w:tcW w:type="dxa" w:w="2600"/>
+            <w:tcMar>
+              <w:top w:type="dxa" w:w="60"/>
+              <w:left w:type="dxa" w:w="80"/>
+              <w:bottom w:type="dxa" w:w="60"/>
+              <w:right w:type="dxa" w:w="80"/>
+            </w:tcMar>
+          </w:tcPr>
+          <w:p>
+            <w:pPr>
+              <w:spacing w:line="276"/>
+            </w:pPr>
+            <w:r>
+              <w:rPr>
+                <w:rFonts w:ascii="Times New Roman" w:cs="Times New Roman" w:eastAsia="Times New Roman" w:hAnsi="Times New Roman"/>
+                <w:b w:val="false"/>
+                <w:bCs w:val="false"/>
+                <w:sz w:val="20"/>
+                <w:szCs w:val="20"/>
+              </w:rPr>
+              <w:t xml:space="preserve">Bi-GRU</w:t>
+            </w:r>
+          </w:p>
+        </w:tc>
+        <w:tc>
+          <w:tcPr>
+            <w:tcW w:type="dxa" w:w="1280"/>
+            <w:tcMar>
+              <w:top w:type="dxa" w:w="60"/>
+              <w:left w:type="dxa" w:w="80"/>
+              <w:bottom w:type="dxa" w:w="60"/>
+              <w:right w:type="dxa" w:w="80"/>
+            </w:tcMar>
+          </w:tcPr>
+          <w:p>
+            <w:pPr>
+              <w:spacing w:line="276"/>
+            </w:pPr>
+            <w:r>
+              <w:rPr>
+                <w:rFonts w:ascii="Times New Roman" w:cs="Times New Roman" w:eastAsia="Times New Roman" w:hAnsi="Times New Roman"/>
+                <w:b w:val="false"/>
+                <w:bCs w:val="false"/>
+                <w:sz w:val="20"/>
+                <w:szCs w:val="20"/>
+              </w:rPr>
+              <w:t xml:space="preserve">0.9293</w:t>
+            </w:r>
+          </w:p>
+        </w:tc>
+        <w:tc>
+          <w:tcPr>
+            <w:tcW w:type="dxa" w:w="1280"/>
+            <w:tcMar>
+              <w:top w:type="dxa" w:w="60"/>
+              <w:left w:type="dxa" w:w="80"/>
+              <w:bottom w:type="dxa" w:w="60"/>
+              <w:right w:type="dxa" w:w="80"/>
+            </w:tcMar>
+          </w:tcPr>
+          <w:p>
+            <w:pPr>
+              <w:spacing w:line="276"/>
+            </w:pPr>
+            <w:r>
+              <w:rPr>
+                <w:rFonts w:ascii="Times New Roman" w:cs="Times New Roman" w:eastAsia="Times New Roman" w:hAnsi="Times New Roman"/>
+                <w:b w:val="false"/>
+                <w:bCs w:val="false"/>
+                <w:sz w:val="20"/>
+                <w:szCs w:val="20"/>
+              </w:rPr>
+              <w:t xml:space="preserve">0.9288</w:t>
+            </w:r>
+          </w:p>
+        </w:tc>
+        <w:tc>
+          <w:tcPr>
+            <w:tcW w:type="dxa" w:w="1280"/>
+            <w:tcMar>
+              <w:top w:type="dxa" w:w="60"/>
+              <w:left w:type="dxa" w:w="80"/>
+              <w:bottom w:type="dxa" w:w="60"/>
+              <w:right w:type="dxa" w:w="80"/>
+            </w:tcMar>
+          </w:tcPr>
+          <w:p>
+            <w:pPr>
+              <w:spacing w:line="276"/>
+            </w:pPr>
+            <w:r>
+              <w:rPr>
+                <w:rFonts w:ascii="Times New Roman" w:cs="Times New Roman" w:eastAsia="Times New Roman" w:hAnsi="Times New Roman"/>
+                <w:b w:val="false"/>
+                <w:bCs w:val="false"/>
+                <w:sz w:val="20"/>
+                <w:szCs w:val="20"/>
+              </w:rPr>
+              <w:t xml:space="preserve">0.8811</w:t>
+            </w:r>
+          </w:p>
+        </w:tc>
+        <w:tc>
+          <w:tcPr>
+            <w:tcW w:type="dxa" w:w="1280"/>
+            <w:tcMar>
+              <w:top w:type="dxa" w:w="60"/>
+              <w:left w:type="dxa" w:w="80"/>
+              <w:bottom w:type="dxa" w:w="60"/>
+              <w:right w:type="dxa" w:w="80"/>
+            </w:tcMar>
+          </w:tcPr>
+          <w:p>
+            <w:pPr>
+              <w:spacing w:line="276"/>
+            </w:pPr>
+            <w:r>
+              <w:rPr>
+                <w:rFonts w:ascii="Times New Roman" w:cs="Times New Roman" w:eastAsia="Times New Roman" w:hAnsi="Times New Roman"/>
+                <w:b w:val="false"/>
+                <w:bCs w:val="false"/>
+                <w:sz w:val="20"/>
+                <w:szCs w:val="20"/>
+              </w:rPr>
+              <w:t xml:space="preserve">0.9723</w:t>
+            </w:r>
+          </w:p>
+        </w:tc>
+        <w:tc>
+          <w:tcPr>
+            <w:tcW w:type="dxa" w:w="1280"/>
+            <w:tcMar>
+              <w:top w:type="dxa" w:w="60"/>
+              <w:left w:type="dxa" w:w="80"/>
+              <w:bottom w:type="dxa" w:w="60"/>
+              <w:right w:type="dxa" w:w="80"/>
+            </w:tcMar>
+          </w:tcPr>
+          <w:p>
+            <w:pPr>
+              <w:spacing w:line="276"/>
+            </w:pPr>
+            <w:r>
+              <w:rPr>
+                <w:rFonts w:ascii="Times New Roman" w:cs="Times New Roman" w:eastAsia="Times New Roman" w:hAnsi="Times New Roman"/>
+                <w:b w:val="false"/>
+                <w:bCs w:val="false"/>
+                <w:sz w:val="20"/>
+                <w:szCs w:val="20"/>
+              </w:rPr>
+              <w:t xml:space="preserve">0.0794</w:t>
             </w:r>
           </w:p>
         </w:tc>
@@ -4229,6 +4387,48 @@
         <w:t xml:space="preserve">Robustness. At ε = 0.1 the undefended hybrid retains 72.76% under the constrained attack and 64.83% under the unconstrained one, so ignoring physical validity overstates the vulnerability by 7.92% points. Adversarial training lifts the constrained figure to 93.75% at ε = 0.1 and 84.13% at ε = 0.2 (undefended: 40.16%), for a clean-accuracy cost of 0.37% points.</w:t>
       </w:r>
     </w:p>
+    <w:p>
+      <w:pPr>
+        <w:spacing w:after="120" w:line="360"/>
+        <w:jc w:val="both"/>
+      </w:pPr>
+      <w:r>
+        <w:rPr>
+          <w:rFonts w:ascii="Times New Roman" w:cs="Times New Roman" w:eastAsia="Times New Roman" w:hAnsi="Times New Roman"/>
+          <w:sz w:val="24"/>
+          <w:szCs w:val="24"/>
+        </w:rPr>
+        <w:t xml:space="preserve">Packet-space black-box attack, Hybrid CNN+MLP: of 198 freshly generated malicious flows, 2.02% were read as benign untouched and 10.10% could be walked across the boundary with legal pad/delay edits within 150 queries, at a mean byte overhead of 78.27% and 31 queries per successful evasion.</w:t>
+      </w:r>
+    </w:p>
+    <w:p>
+      <w:pPr>
+        <w:spacing w:after="120" w:line="360"/>
+        <w:jc w:val="both"/>
+      </w:pPr>
+      <w:r>
+        <w:rPr>
+          <w:rFonts w:ascii="Times New Roman" w:cs="Times New Roman" w:eastAsia="Times New Roman" w:hAnsi="Times New Roman"/>
+          <w:sz w:val="24"/>
+          <w:szCs w:val="24"/>
+        </w:rPr>
+        <w:t xml:space="preserve">Packet-space black-box attack, Hybrid + adversarial training: of 198 freshly generated malicious flows, 2.02% were read as benign untouched and 10.61% could be walked across the boundary with legal pad/delay edits within 150 queries, at a mean byte overhead of 86.36% and 31 queries per successful evasion.</w:t>
+      </w:r>
+    </w:p>
+    <w:p>
+      <w:pPr>
+        <w:spacing w:after="120" w:line="360"/>
+        <w:jc w:val="both"/>
+      </w:pPr>
+      <w:r>
+        <w:rPr>
+          <w:rFonts w:ascii="Times New Roman" w:cs="Times New Roman" w:eastAsia="Times New Roman" w:hAnsi="Times New Roman"/>
+          <w:sz w:val="24"/>
+          <w:szCs w:val="24"/>
+        </w:rPr>
+        <w:t xml:space="preserve">Adversarial training does not transfer to this attack: the packet-space evasion rate is 10.10% for the undefended hybrid and 10.61% for the defended one, while the same defense cut gradient-PGD evasion by more than half. The training attack lives in feature space under an L-infinity budget; the packet-space search moves along a different path (a few large pads and delays on a subset of packets) that the defended model never saw. The two attacks measure different things, and a defense evaluated against only the attack it was trained on would have looked far better than it is. The attacker's price is the other half of the result: the successful evasions cost on average 86.36% extra bytes, so a detector that forces an exfiltration channel to nearly double its volume has still raised the attacker's cost substantially even where it is eventually evaded.</w:t>
+      </w:r>
+    </w:p>
     <w:tbl>
       <w:tblPr>
         <w:tblW w:type="dxa" w:w="9000"/>
@@ -4242,11 +4442,12 @@
         </w:tblBorders>
       </w:tblPr>
       <w:tblGrid>
-        <w:gridCol w:w="1800"/>
-        <w:gridCol w:w="1800"/>
-        <w:gridCol w:w="1800"/>
-        <w:gridCol w:w="1800"/>
-        <w:gridCol w:w="1800"/>
+        <w:gridCol w:w="1500"/>
+        <w:gridCol w:w="1500"/>
+        <w:gridCol w:w="1500"/>
+        <w:gridCol w:w="1500"/>
+        <w:gridCol w:w="1500"/>
+        <w:gridCol w:w="1500"/>
       </w:tblGrid>
       <w:tr>
         <w:trPr>
@@ -4254,7 +4455,7 @@
         </w:trPr>
         <w:tc>
           <w:tcPr>
-            <w:tcW w:type="dxa" w:w="1800"/>
+            <w:tcW w:type="dxa" w:w="1500"/>
             <w:shd w:fill="E7E6E6" w:color="auto" w:val="clear"/>
             <w:tcMar>
               <w:top w:type="dxa" w:w="60"/>
@@ -4281,7 +4482,7 @@
         </w:tc>
         <w:tc>
           <w:tcPr>
-            <w:tcW w:type="dxa" w:w="1800"/>
+            <w:tcW w:type="dxa" w:w="1500"/>
             <w:shd w:fill="E7E6E6" w:color="auto" w:val="clear"/>
             <w:tcMar>
               <w:top w:type="dxa" w:w="60"/>
@@ -4308,7 +4509,7 @@
         </w:tc>
         <w:tc>
           <w:tcPr>
-            <w:tcW w:type="dxa" w:w="1800"/>
+            <w:tcW w:type="dxa" w:w="1500"/>
             <w:shd w:fill="E7E6E6" w:color="auto" w:val="clear"/>
             <w:tcMar>
               <w:top w:type="dxa" w:w="60"/>
@@ -4329,13 +4530,13 @@
                 <w:sz w:val="20"/>
                 <w:szCs w:val="20"/>
               </w:rPr>
-              <w:t xml:space="preserve">hybrid</w:t>
-            </w:r>
-          </w:p>
-        </w:tc>
-        <w:tc>
-          <w:tcPr>
-            <w:tcW w:type="dxa" w:w="1800"/>
+              <w:t xml:space="preserve">gru</w:t>
+            </w:r>
+          </w:p>
+        </w:tc>
+        <w:tc>
+          <w:tcPr>
+            <w:tcW w:type="dxa" w:w="1500"/>
             <w:shd w:fill="E7E6E6" w:color="auto" w:val="clear"/>
             <w:tcMar>
               <w:top w:type="dxa" w:w="60"/>
@@ -4356,13 +4557,13 @@
                 <w:sz w:val="20"/>
                 <w:szCs w:val="20"/>
               </w:rPr>
-              <w:t xml:space="preserve">hybrid_advtrain</w:t>
-            </w:r>
-          </w:p>
-        </w:tc>
-        <w:tc>
-          <w:tcPr>
-            <w:tcW w:type="dxa" w:w="1800"/>
+              <w:t xml:space="preserve">hybrid</w:t>
+            </w:r>
+          </w:p>
+        </w:tc>
+        <w:tc>
+          <w:tcPr>
+            <w:tcW w:type="dxa" w:w="1500"/>
             <w:shd w:fill="E7E6E6" w:color="auto" w:val="clear"/>
             <w:tcMar>
               <w:top w:type="dxa" w:w="60"/>
@@ -4383,6 +4584,33 @@
                 <w:sz w:val="20"/>
                 <w:szCs w:val="20"/>
               </w:rPr>
+              <w:t xml:space="preserve">hybrid_advtrain</w:t>
+            </w:r>
+          </w:p>
+        </w:tc>
+        <w:tc>
+          <w:tcPr>
+            <w:tcW w:type="dxa" w:w="1500"/>
+            <w:shd w:fill="E7E6E6" w:color="auto" w:val="clear"/>
+            <w:tcMar>
+              <w:top w:type="dxa" w:w="60"/>
+              <w:left w:type="dxa" w:w="80"/>
+              <w:bottom w:type="dxa" w:w="60"/>
+              <w:right w:type="dxa" w:w="80"/>
+            </w:tcMar>
+          </w:tcPr>
+          <w:p>
+            <w:pPr>
+              <w:spacing w:line="276"/>
+            </w:pPr>
+            <w:r>
+              <w:rPr>
+                <w:rFonts w:ascii="Times New Roman" w:cs="Times New Roman" w:eastAsia="Times New Roman" w:hAnsi="Times New Roman"/>
+                <w:b/>
+                <w:bCs/>
+                <w:sz w:val="20"/>
+                <w:szCs w:val="20"/>
+              </w:rPr>
               <w:t xml:space="preserve">mlp</w:t>
             </w:r>
           </w:p>
@@ -4391,7 +4619,7 @@
       <w:tr>
         <w:tc>
           <w:tcPr>
-            <w:tcW w:type="dxa" w:w="1800"/>
+            <w:tcW w:type="dxa" w:w="1500"/>
             <w:tcMar>
               <w:top w:type="dxa" w:w="60"/>
               <w:left w:type="dxa" w:w="80"/>
@@ -4417,105 +4645,131 @@
         </w:tc>
         <w:tc>
           <w:tcPr>
-            <w:tcW w:type="dxa" w:w="1800"/>
-            <w:tcMar>
-              <w:top w:type="dxa" w:w="60"/>
-              <w:left w:type="dxa" w:w="80"/>
-              <w:bottom w:type="dxa" w:w="60"/>
-              <w:right w:type="dxa" w:w="80"/>
-            </w:tcMar>
-          </w:tcPr>
-          <w:p>
-            <w:pPr>
-              <w:spacing w:line="276"/>
-            </w:pPr>
-            <w:r>
-              <w:rPr>
-                <w:rFonts w:ascii="Times New Roman" w:cs="Times New Roman" w:eastAsia="Times New Roman" w:hAnsi="Times New Roman"/>
-                <w:b w:val="false"/>
-                <w:bCs w:val="false"/>
-                <w:sz w:val="20"/>
-                <w:szCs w:val="20"/>
-              </w:rPr>
-              <w:t xml:space="preserve">0.5119</w:t>
-            </w:r>
-          </w:p>
-        </w:tc>
-        <w:tc>
-          <w:tcPr>
-            <w:tcW w:type="dxa" w:w="1800"/>
-            <w:tcMar>
-              <w:top w:type="dxa" w:w="60"/>
-              <w:left w:type="dxa" w:w="80"/>
-              <w:bottom w:type="dxa" w:w="60"/>
-              <w:right w:type="dxa" w:w="80"/>
-            </w:tcMar>
-          </w:tcPr>
-          <w:p>
-            <w:pPr>
-              <w:spacing w:line="276"/>
-            </w:pPr>
-            <w:r>
-              <w:rPr>
-                <w:rFonts w:ascii="Times New Roman" w:cs="Times New Roman" w:eastAsia="Times New Roman" w:hAnsi="Times New Roman"/>
-                <w:b w:val="false"/>
-                <w:bCs w:val="false"/>
-                <w:sz w:val="20"/>
-                <w:szCs w:val="20"/>
-              </w:rPr>
-              <w:t xml:space="preserve">0.9585</w:t>
-            </w:r>
-          </w:p>
-        </w:tc>
-        <w:tc>
-          <w:tcPr>
-            <w:tcW w:type="dxa" w:w="1800"/>
-            <w:tcMar>
-              <w:top w:type="dxa" w:w="60"/>
-              <w:left w:type="dxa" w:w="80"/>
-              <w:bottom w:type="dxa" w:w="60"/>
-              <w:right w:type="dxa" w:w="80"/>
-            </w:tcMar>
-          </w:tcPr>
-          <w:p>
-            <w:pPr>
-              <w:spacing w:line="276"/>
-            </w:pPr>
-            <w:r>
-              <w:rPr>
-                <w:rFonts w:ascii="Times New Roman" w:cs="Times New Roman" w:eastAsia="Times New Roman" w:hAnsi="Times New Roman"/>
-                <w:b w:val="false"/>
-                <w:bCs w:val="false"/>
-                <w:sz w:val="20"/>
-                <w:szCs w:val="20"/>
-              </w:rPr>
-              <w:t xml:space="preserve">0.9623</w:t>
-            </w:r>
-          </w:p>
-        </w:tc>
-        <w:tc>
-          <w:tcPr>
-            <w:tcW w:type="dxa" w:w="1800"/>
-            <w:tcMar>
-              <w:top w:type="dxa" w:w="60"/>
-              <w:left w:type="dxa" w:w="80"/>
-              <w:bottom w:type="dxa" w:w="60"/>
-              <w:right w:type="dxa" w:w="80"/>
-            </w:tcMar>
-          </w:tcPr>
-          <w:p>
-            <w:pPr>
-              <w:spacing w:line="276"/>
-            </w:pPr>
-            <w:r>
-              <w:rPr>
-                <w:rFonts w:ascii="Times New Roman" w:cs="Times New Roman" w:eastAsia="Times New Roman" w:hAnsi="Times New Roman"/>
-                <w:b w:val="false"/>
-                <w:bCs w:val="false"/>
-                <w:sz w:val="20"/>
-                <w:szCs w:val="20"/>
-              </w:rPr>
-              <w:t xml:space="preserve">0.9618</w:t>
+            <w:tcW w:type="dxa" w:w="1500"/>
+            <w:tcMar>
+              <w:top w:type="dxa" w:w="60"/>
+              <w:left w:type="dxa" w:w="80"/>
+              <w:bottom w:type="dxa" w:w="60"/>
+              <w:right w:type="dxa" w:w="80"/>
+            </w:tcMar>
+          </w:tcPr>
+          <w:p>
+            <w:pPr>
+              <w:spacing w:line="276"/>
+            </w:pPr>
+            <w:r>
+              <w:rPr>
+                <w:rFonts w:ascii="Times New Roman" w:cs="Times New Roman" w:eastAsia="Times New Roman" w:hAnsi="Times New Roman"/>
+                <w:b w:val="false"/>
+                <w:bCs w:val="false"/>
+                <w:sz w:val="20"/>
+                <w:szCs w:val="20"/>
+              </w:rPr>
+              <w:t xml:space="preserve">0.5300</w:t>
+            </w:r>
+          </w:p>
+        </w:tc>
+        <w:tc>
+          <w:tcPr>
+            <w:tcW w:type="dxa" w:w="1500"/>
+            <w:tcMar>
+              <w:top w:type="dxa" w:w="60"/>
+              <w:left w:type="dxa" w:w="80"/>
+              <w:bottom w:type="dxa" w:w="60"/>
+              <w:right w:type="dxa" w:w="80"/>
+            </w:tcMar>
+          </w:tcPr>
+          <w:p>
+            <w:pPr>
+              <w:spacing w:line="276"/>
+            </w:pPr>
+            <w:r>
+              <w:rPr>
+                <w:rFonts w:ascii="Times New Roman" w:cs="Times New Roman" w:eastAsia="Times New Roman" w:hAnsi="Times New Roman"/>
+                <w:b w:val="false"/>
+                <w:bCs w:val="false"/>
+                <w:sz w:val="20"/>
+                <w:szCs w:val="20"/>
+              </w:rPr>
+              <w:t xml:space="preserve">0.5450</w:t>
+            </w:r>
+          </w:p>
+        </w:tc>
+        <w:tc>
+          <w:tcPr>
+            <w:tcW w:type="dxa" w:w="1500"/>
+            <w:tcMar>
+              <w:top w:type="dxa" w:w="60"/>
+              <w:left w:type="dxa" w:w="80"/>
+              <w:bottom w:type="dxa" w:w="60"/>
+              <w:right w:type="dxa" w:w="80"/>
+            </w:tcMar>
+          </w:tcPr>
+          <w:p>
+            <w:pPr>
+              <w:spacing w:line="276"/>
+            </w:pPr>
+            <w:r>
+              <w:rPr>
+                <w:rFonts w:ascii="Times New Roman" w:cs="Times New Roman" w:eastAsia="Times New Roman" w:hAnsi="Times New Roman"/>
+                <w:b w:val="false"/>
+                <w:bCs w:val="false"/>
+                <w:sz w:val="20"/>
+                <w:szCs w:val="20"/>
+              </w:rPr>
+              <w:t xml:space="preserve">0.9640</w:t>
+            </w:r>
+          </w:p>
+        </w:tc>
+        <w:tc>
+          <w:tcPr>
+            <w:tcW w:type="dxa" w:w="1500"/>
+            <w:tcMar>
+              <w:top w:type="dxa" w:w="60"/>
+              <w:left w:type="dxa" w:w="80"/>
+              <w:bottom w:type="dxa" w:w="60"/>
+              <w:right w:type="dxa" w:w="80"/>
+            </w:tcMar>
+          </w:tcPr>
+          <w:p>
+            <w:pPr>
+              <w:spacing w:line="276"/>
+            </w:pPr>
+            <w:r>
+              <w:rPr>
+                <w:rFonts w:ascii="Times New Roman" w:cs="Times New Roman" w:eastAsia="Times New Roman" w:hAnsi="Times New Roman"/>
+                <w:b w:val="false"/>
+                <w:bCs w:val="false"/>
+                <w:sz w:val="20"/>
+                <w:szCs w:val="20"/>
+              </w:rPr>
+              <w:t xml:space="preserve">0.9680</w:t>
+            </w:r>
+          </w:p>
+        </w:tc>
+        <w:tc>
+          <w:tcPr>
+            <w:tcW w:type="dxa" w:w="1500"/>
+            <w:tcMar>
+              <w:top w:type="dxa" w:w="60"/>
+              <w:left w:type="dxa" w:w="80"/>
+              <w:bottom w:type="dxa" w:w="60"/>
+              <w:right w:type="dxa" w:w="80"/>
+            </w:tcMar>
+          </w:tcPr>
+          <w:p>
+            <w:pPr>
+              <w:spacing w:line="276"/>
+            </w:pPr>
+            <w:r>
+              <w:rPr>
+                <w:rFonts w:ascii="Times New Roman" w:cs="Times New Roman" w:eastAsia="Times New Roman" w:hAnsi="Times New Roman"/>
+                <w:b w:val="false"/>
+                <w:bCs w:val="false"/>
+                <w:sz w:val="20"/>
+                <w:szCs w:val="20"/>
+              </w:rPr>
+              <w:t xml:space="preserve">0.9700</w:t>
             </w:r>
           </w:p>
         </w:tc>
@@ -4523,131 +4777,157 @@
       <w:tr>
         <w:tc>
           <w:tcPr>
-            <w:tcW w:type="dxa" w:w="1800"/>
-            <w:tcMar>
-              <w:top w:type="dxa" w:w="60"/>
-              <w:left w:type="dxa" w:w="80"/>
-              <w:bottom w:type="dxa" w:w="60"/>
-              <w:right w:type="dxa" w:w="80"/>
-            </w:tcMar>
-          </w:tcPr>
-          <w:p>
-            <w:pPr>
-              <w:spacing w:line="276"/>
-            </w:pPr>
-            <w:r>
-              <w:rPr>
-                <w:rFonts w:ascii="Times New Roman" w:cs="Times New Roman" w:eastAsia="Times New Roman" w:hAnsi="Times New Roman"/>
-                <w:b w:val="false"/>
-                <w:bCs w:val="false"/>
-                <w:sz w:val="20"/>
-                <w:szCs w:val="20"/>
-              </w:rPr>
-              <w:t xml:space="preserve">hybrid</w:t>
-            </w:r>
-          </w:p>
-        </w:tc>
-        <w:tc>
-          <w:tcPr>
-            <w:tcW w:type="dxa" w:w="1800"/>
-            <w:tcMar>
-              <w:top w:type="dxa" w:w="60"/>
-              <w:left w:type="dxa" w:w="80"/>
-              <w:bottom w:type="dxa" w:w="60"/>
-              <w:right w:type="dxa" w:w="80"/>
-            </w:tcMar>
-          </w:tcPr>
-          <w:p>
-            <w:pPr>
-              <w:spacing w:line="276"/>
-            </w:pPr>
-            <w:r>
-              <w:rPr>
-                <w:rFonts w:ascii="Times New Roman" w:cs="Times New Roman" w:eastAsia="Times New Roman" w:hAnsi="Times New Roman"/>
-                <w:b w:val="false"/>
-                <w:bCs w:val="false"/>
-                <w:sz w:val="20"/>
-                <w:szCs w:val="20"/>
-              </w:rPr>
-              <w:t xml:space="preserve">0.5911</w:t>
-            </w:r>
-          </w:p>
-        </w:tc>
-        <w:tc>
-          <w:tcPr>
-            <w:tcW w:type="dxa" w:w="1800"/>
-            <w:tcMar>
-              <w:top w:type="dxa" w:w="60"/>
-              <w:left w:type="dxa" w:w="80"/>
-              <w:bottom w:type="dxa" w:w="60"/>
-              <w:right w:type="dxa" w:w="80"/>
-            </w:tcMar>
-          </w:tcPr>
-          <w:p>
-            <w:pPr>
-              <w:spacing w:line="276"/>
-            </w:pPr>
-            <w:r>
-              <w:rPr>
-                <w:rFonts w:ascii="Times New Roman" w:cs="Times New Roman" w:eastAsia="Times New Roman" w:hAnsi="Times New Roman"/>
-                <w:b w:val="false"/>
-                <w:bCs w:val="false"/>
-                <w:sz w:val="20"/>
-                <w:szCs w:val="20"/>
-              </w:rPr>
-              <w:t xml:space="preserve">0.7276</w:t>
-            </w:r>
-          </w:p>
-        </w:tc>
-        <w:tc>
-          <w:tcPr>
-            <w:tcW w:type="dxa" w:w="1800"/>
-            <w:tcMar>
-              <w:top w:type="dxa" w:w="60"/>
-              <w:left w:type="dxa" w:w="80"/>
-              <w:bottom w:type="dxa" w:w="60"/>
-              <w:right w:type="dxa" w:w="80"/>
-            </w:tcMar>
-          </w:tcPr>
-          <w:p>
-            <w:pPr>
-              <w:spacing w:line="276"/>
-            </w:pPr>
-            <w:r>
-              <w:rPr>
-                <w:rFonts w:ascii="Times New Roman" w:cs="Times New Roman" w:eastAsia="Times New Roman" w:hAnsi="Times New Roman"/>
-                <w:b w:val="false"/>
-                <w:bCs w:val="false"/>
-                <w:sz w:val="20"/>
-                <w:szCs w:val="20"/>
-              </w:rPr>
-              <w:t xml:space="preserve">0.9460</w:t>
-            </w:r>
-          </w:p>
-        </w:tc>
-        <w:tc>
-          <w:tcPr>
-            <w:tcW w:type="dxa" w:w="1800"/>
-            <w:tcMar>
-              <w:top w:type="dxa" w:w="60"/>
-              <w:left w:type="dxa" w:w="80"/>
-              <w:bottom w:type="dxa" w:w="60"/>
-              <w:right w:type="dxa" w:w="80"/>
-            </w:tcMar>
-          </w:tcPr>
-          <w:p>
-            <w:pPr>
-              <w:spacing w:line="276"/>
-            </w:pPr>
-            <w:r>
-              <w:rPr>
-                <w:rFonts w:ascii="Times New Roman" w:cs="Times New Roman" w:eastAsia="Times New Roman" w:hAnsi="Times New Roman"/>
-                <w:b w:val="false"/>
-                <w:bCs w:val="false"/>
-                <w:sz w:val="20"/>
-                <w:szCs w:val="20"/>
-              </w:rPr>
-              <w:t xml:space="preserve">0.8060</w:t>
+            <w:tcW w:type="dxa" w:w="1500"/>
+            <w:tcMar>
+              <w:top w:type="dxa" w:w="60"/>
+              <w:left w:type="dxa" w:w="80"/>
+              <w:bottom w:type="dxa" w:w="60"/>
+              <w:right w:type="dxa" w:w="80"/>
+            </w:tcMar>
+          </w:tcPr>
+          <w:p>
+            <w:pPr>
+              <w:spacing w:line="276"/>
+            </w:pPr>
+            <w:r>
+              <w:rPr>
+                <w:rFonts w:ascii="Times New Roman" w:cs="Times New Roman" w:eastAsia="Times New Roman" w:hAnsi="Times New Roman"/>
+                <w:b w:val="false"/>
+                <w:bCs w:val="false"/>
+                <w:sz w:val="20"/>
+                <w:szCs w:val="20"/>
+              </w:rPr>
+              <w:t xml:space="preserve">gru</w:t>
+            </w:r>
+          </w:p>
+        </w:tc>
+        <w:tc>
+          <w:tcPr>
+            <w:tcW w:type="dxa" w:w="1500"/>
+            <w:tcMar>
+              <w:top w:type="dxa" w:w="60"/>
+              <w:left w:type="dxa" w:w="80"/>
+              <w:bottom w:type="dxa" w:w="60"/>
+              <w:right w:type="dxa" w:w="80"/>
+            </w:tcMar>
+          </w:tcPr>
+          <w:p>
+            <w:pPr>
+              <w:spacing w:line="276"/>
+            </w:pPr>
+            <w:r>
+              <w:rPr>
+                <w:rFonts w:ascii="Times New Roman" w:cs="Times New Roman" w:eastAsia="Times New Roman" w:hAnsi="Times New Roman"/>
+                <w:b w:val="false"/>
+                <w:bCs w:val="false"/>
+                <w:sz w:val="20"/>
+                <w:szCs w:val="20"/>
+              </w:rPr>
+              <w:t xml:space="preserve">0.5840</w:t>
+            </w:r>
+          </w:p>
+        </w:tc>
+        <w:tc>
+          <w:tcPr>
+            <w:tcW w:type="dxa" w:w="1500"/>
+            <w:tcMar>
+              <w:top w:type="dxa" w:w="60"/>
+              <w:left w:type="dxa" w:w="80"/>
+              <w:bottom w:type="dxa" w:w="60"/>
+              <w:right w:type="dxa" w:w="80"/>
+            </w:tcMar>
+          </w:tcPr>
+          <w:p>
+            <w:pPr>
+              <w:spacing w:line="276"/>
+            </w:pPr>
+            <w:r>
+              <w:rPr>
+                <w:rFonts w:ascii="Times New Roman" w:cs="Times New Roman" w:eastAsia="Times New Roman" w:hAnsi="Times New Roman"/>
+                <w:b w:val="false"/>
+                <w:bCs w:val="false"/>
+                <w:sz w:val="20"/>
+                <w:szCs w:val="20"/>
+              </w:rPr>
+              <w:t xml:space="preserve">0.4780</w:t>
+            </w:r>
+          </w:p>
+        </w:tc>
+        <w:tc>
+          <w:tcPr>
+            <w:tcW w:type="dxa" w:w="1500"/>
+            <w:tcMar>
+              <w:top w:type="dxa" w:w="60"/>
+              <w:left w:type="dxa" w:w="80"/>
+              <w:bottom w:type="dxa" w:w="60"/>
+              <w:right w:type="dxa" w:w="80"/>
+            </w:tcMar>
+          </w:tcPr>
+          <w:p>
+            <w:pPr>
+              <w:spacing w:line="276"/>
+            </w:pPr>
+            <w:r>
+              <w:rPr>
+                <w:rFonts w:ascii="Times New Roman" w:cs="Times New Roman" w:eastAsia="Times New Roman" w:hAnsi="Times New Roman"/>
+                <w:b w:val="false"/>
+                <w:bCs w:val="false"/>
+                <w:sz w:val="20"/>
+                <w:szCs w:val="20"/>
+              </w:rPr>
+              <w:t xml:space="preserve">0.9650</w:t>
+            </w:r>
+          </w:p>
+        </w:tc>
+        <w:tc>
+          <w:tcPr>
+            <w:tcW w:type="dxa" w:w="1500"/>
+            <w:tcMar>
+              <w:top w:type="dxa" w:w="60"/>
+              <w:left w:type="dxa" w:w="80"/>
+              <w:bottom w:type="dxa" w:w="60"/>
+              <w:right w:type="dxa" w:w="80"/>
+            </w:tcMar>
+          </w:tcPr>
+          <w:p>
+            <w:pPr>
+              <w:spacing w:line="276"/>
+            </w:pPr>
+            <w:r>
+              <w:rPr>
+                <w:rFonts w:ascii="Times New Roman" w:cs="Times New Roman" w:eastAsia="Times New Roman" w:hAnsi="Times New Roman"/>
+                <w:b w:val="false"/>
+                <w:bCs w:val="false"/>
+                <w:sz w:val="20"/>
+                <w:szCs w:val="20"/>
+              </w:rPr>
+              <w:t xml:space="preserve">0.9680</w:t>
+            </w:r>
+          </w:p>
+        </w:tc>
+        <w:tc>
+          <w:tcPr>
+            <w:tcW w:type="dxa" w:w="1500"/>
+            <w:tcMar>
+              <w:top w:type="dxa" w:w="60"/>
+              <w:left w:type="dxa" w:w="80"/>
+              <w:bottom w:type="dxa" w:w="60"/>
+              <w:right w:type="dxa" w:w="80"/>
+            </w:tcMar>
+          </w:tcPr>
+          <w:p>
+            <w:pPr>
+              <w:spacing w:line="276"/>
+            </w:pPr>
+            <w:r>
+              <w:rPr>
+                <w:rFonts w:ascii="Times New Roman" w:cs="Times New Roman" w:eastAsia="Times New Roman" w:hAnsi="Times New Roman"/>
+                <w:b w:val="false"/>
+                <w:bCs w:val="false"/>
+                <w:sz w:val="20"/>
+                <w:szCs w:val="20"/>
+              </w:rPr>
+              <w:t xml:space="preserve">0.9700</w:t>
             </w:r>
           </w:p>
         </w:tc>
@@ -4655,131 +4935,157 @@
       <w:tr>
         <w:tc>
           <w:tcPr>
-            <w:tcW w:type="dxa" w:w="1800"/>
-            <w:tcMar>
-              <w:top w:type="dxa" w:w="60"/>
-              <w:left w:type="dxa" w:w="80"/>
-              <w:bottom w:type="dxa" w:w="60"/>
-              <w:right w:type="dxa" w:w="80"/>
-            </w:tcMar>
-          </w:tcPr>
-          <w:p>
-            <w:pPr>
-              <w:spacing w:line="276"/>
-            </w:pPr>
-            <w:r>
-              <w:rPr>
-                <w:rFonts w:ascii="Times New Roman" w:cs="Times New Roman" w:eastAsia="Times New Roman" w:hAnsi="Times New Roman"/>
-                <w:b w:val="false"/>
-                <w:bCs w:val="false"/>
-                <w:sz w:val="20"/>
-                <w:szCs w:val="20"/>
-              </w:rPr>
-              <w:t xml:space="preserve">hybrid_advtrain</w:t>
-            </w:r>
-          </w:p>
-        </w:tc>
-        <w:tc>
-          <w:tcPr>
-            <w:tcW w:type="dxa" w:w="1800"/>
-            <w:tcMar>
-              <w:top w:type="dxa" w:w="60"/>
-              <w:left w:type="dxa" w:w="80"/>
-              <w:bottom w:type="dxa" w:w="60"/>
-              <w:right w:type="dxa" w:w="80"/>
-            </w:tcMar>
-          </w:tcPr>
-          <w:p>
-            <w:pPr>
-              <w:spacing w:line="276"/>
-            </w:pPr>
-            <w:r>
-              <w:rPr>
-                <w:rFonts w:ascii="Times New Roman" w:cs="Times New Roman" w:eastAsia="Times New Roman" w:hAnsi="Times New Roman"/>
-                <w:b w:val="false"/>
-                <w:bCs w:val="false"/>
-                <w:sz w:val="20"/>
-                <w:szCs w:val="20"/>
-              </w:rPr>
-              <w:t xml:space="preserve">0.7168</w:t>
-            </w:r>
-          </w:p>
-        </w:tc>
-        <w:tc>
-          <w:tcPr>
-            <w:tcW w:type="dxa" w:w="1800"/>
-            <w:tcMar>
-              <w:top w:type="dxa" w:w="60"/>
-              <w:left w:type="dxa" w:w="80"/>
-              <w:bottom w:type="dxa" w:w="60"/>
-              <w:right w:type="dxa" w:w="80"/>
-            </w:tcMar>
-          </w:tcPr>
-          <w:p>
-            <w:pPr>
-              <w:spacing w:line="276"/>
-            </w:pPr>
-            <w:r>
-              <w:rPr>
-                <w:rFonts w:ascii="Times New Roman" w:cs="Times New Roman" w:eastAsia="Times New Roman" w:hAnsi="Times New Roman"/>
-                <w:b w:val="false"/>
-                <w:bCs w:val="false"/>
-                <w:sz w:val="20"/>
-                <w:szCs w:val="20"/>
-              </w:rPr>
-              <w:t xml:space="preserve">0.8908</w:t>
-            </w:r>
-          </w:p>
-        </w:tc>
-        <w:tc>
-          <w:tcPr>
-            <w:tcW w:type="dxa" w:w="1800"/>
-            <w:tcMar>
-              <w:top w:type="dxa" w:w="60"/>
-              <w:left w:type="dxa" w:w="80"/>
-              <w:bottom w:type="dxa" w:w="60"/>
-              <w:right w:type="dxa" w:w="80"/>
-            </w:tcMar>
-          </w:tcPr>
-          <w:p>
-            <w:pPr>
-              <w:spacing w:line="276"/>
-            </w:pPr>
-            <w:r>
-              <w:rPr>
-                <w:rFonts w:ascii="Times New Roman" w:cs="Times New Roman" w:eastAsia="Times New Roman" w:hAnsi="Times New Roman"/>
-                <w:b w:val="false"/>
-                <w:bCs w:val="false"/>
-                <w:sz w:val="20"/>
-                <w:szCs w:val="20"/>
-              </w:rPr>
-              <w:t xml:space="preserve">0.9375</w:t>
-            </w:r>
-          </w:p>
-        </w:tc>
-        <w:tc>
-          <w:tcPr>
-            <w:tcW w:type="dxa" w:w="1800"/>
-            <w:tcMar>
-              <w:top w:type="dxa" w:w="60"/>
-              <w:left w:type="dxa" w:w="80"/>
-              <w:bottom w:type="dxa" w:w="60"/>
-              <w:right w:type="dxa" w:w="80"/>
-            </w:tcMar>
-          </w:tcPr>
-          <w:p>
-            <w:pPr>
-              <w:spacing w:line="276"/>
-            </w:pPr>
-            <w:r>
-              <w:rPr>
-                <w:rFonts w:ascii="Times New Roman" w:cs="Times New Roman" w:eastAsia="Times New Roman" w:hAnsi="Times New Roman"/>
-                <w:b w:val="false"/>
-                <w:bCs w:val="false"/>
-                <w:sz w:val="20"/>
-                <w:szCs w:val="20"/>
-              </w:rPr>
-              <w:t xml:space="preserve">0.9033</w:t>
+            <w:tcW w:type="dxa" w:w="1500"/>
+            <w:tcMar>
+              <w:top w:type="dxa" w:w="60"/>
+              <w:left w:type="dxa" w:w="80"/>
+              <w:bottom w:type="dxa" w:w="60"/>
+              <w:right w:type="dxa" w:w="80"/>
+            </w:tcMar>
+          </w:tcPr>
+          <w:p>
+            <w:pPr>
+              <w:spacing w:line="276"/>
+            </w:pPr>
+            <w:r>
+              <w:rPr>
+                <w:rFonts w:ascii="Times New Roman" w:cs="Times New Roman" w:eastAsia="Times New Roman" w:hAnsi="Times New Roman"/>
+                <w:b w:val="false"/>
+                <w:bCs w:val="false"/>
+                <w:sz w:val="20"/>
+                <w:szCs w:val="20"/>
+              </w:rPr>
+              <w:t xml:space="preserve">hybrid</w:t>
+            </w:r>
+          </w:p>
+        </w:tc>
+        <w:tc>
+          <w:tcPr>
+            <w:tcW w:type="dxa" w:w="1500"/>
+            <w:tcMar>
+              <w:top w:type="dxa" w:w="60"/>
+              <w:left w:type="dxa" w:w="80"/>
+              <w:bottom w:type="dxa" w:w="60"/>
+              <w:right w:type="dxa" w:w="80"/>
+            </w:tcMar>
+          </w:tcPr>
+          <w:p>
+            <w:pPr>
+              <w:spacing w:line="276"/>
+            </w:pPr>
+            <w:r>
+              <w:rPr>
+                <w:rFonts w:ascii="Times New Roman" w:cs="Times New Roman" w:eastAsia="Times New Roman" w:hAnsi="Times New Roman"/>
+                <w:b w:val="false"/>
+                <w:bCs w:val="false"/>
+                <w:sz w:val="20"/>
+                <w:szCs w:val="20"/>
+              </w:rPr>
+              <w:t xml:space="preserve">0.6090</w:t>
+            </w:r>
+          </w:p>
+        </w:tc>
+        <w:tc>
+          <w:tcPr>
+            <w:tcW w:type="dxa" w:w="1500"/>
+            <w:tcMar>
+              <w:top w:type="dxa" w:w="60"/>
+              <w:left w:type="dxa" w:w="80"/>
+              <w:bottom w:type="dxa" w:w="60"/>
+              <w:right w:type="dxa" w:w="80"/>
+            </w:tcMar>
+          </w:tcPr>
+          <w:p>
+            <w:pPr>
+              <w:spacing w:line="276"/>
+            </w:pPr>
+            <w:r>
+              <w:rPr>
+                <w:rFonts w:ascii="Times New Roman" w:cs="Times New Roman" w:eastAsia="Times New Roman" w:hAnsi="Times New Roman"/>
+                <w:b w:val="false"/>
+                <w:bCs w:val="false"/>
+                <w:sz w:val="20"/>
+                <w:szCs w:val="20"/>
+              </w:rPr>
+              <w:t xml:space="preserve">0.5640</w:t>
+            </w:r>
+          </w:p>
+        </w:tc>
+        <w:tc>
+          <w:tcPr>
+            <w:tcW w:type="dxa" w:w="1500"/>
+            <w:tcMar>
+              <w:top w:type="dxa" w:w="60"/>
+              <w:left w:type="dxa" w:w="80"/>
+              <w:bottom w:type="dxa" w:w="60"/>
+              <w:right w:type="dxa" w:w="80"/>
+            </w:tcMar>
+          </w:tcPr>
+          <w:p>
+            <w:pPr>
+              <w:spacing w:line="276"/>
+            </w:pPr>
+            <w:r>
+              <w:rPr>
+                <w:rFonts w:ascii="Times New Roman" w:cs="Times New Roman" w:eastAsia="Times New Roman" w:hAnsi="Times New Roman"/>
+                <w:b w:val="false"/>
+                <w:bCs w:val="false"/>
+                <w:sz w:val="20"/>
+                <w:szCs w:val="20"/>
+              </w:rPr>
+              <w:t xml:space="preserve">0.7360</w:t>
+            </w:r>
+          </w:p>
+        </w:tc>
+        <w:tc>
+          <w:tcPr>
+            <w:tcW w:type="dxa" w:w="1500"/>
+            <w:tcMar>
+              <w:top w:type="dxa" w:w="60"/>
+              <w:left w:type="dxa" w:w="80"/>
+              <w:bottom w:type="dxa" w:w="60"/>
+              <w:right w:type="dxa" w:w="80"/>
+            </w:tcMar>
+          </w:tcPr>
+          <w:p>
+            <w:pPr>
+              <w:spacing w:line="276"/>
+            </w:pPr>
+            <w:r>
+              <w:rPr>
+                <w:rFonts w:ascii="Times New Roman" w:cs="Times New Roman" w:eastAsia="Times New Roman" w:hAnsi="Times New Roman"/>
+                <w:b w:val="false"/>
+                <w:bCs w:val="false"/>
+                <w:sz w:val="20"/>
+                <w:szCs w:val="20"/>
+              </w:rPr>
+              <w:t xml:space="preserve">0.9550</w:t>
+            </w:r>
+          </w:p>
+        </w:tc>
+        <w:tc>
+          <w:tcPr>
+            <w:tcW w:type="dxa" w:w="1500"/>
+            <w:tcMar>
+              <w:top w:type="dxa" w:w="60"/>
+              <w:left w:type="dxa" w:w="80"/>
+              <w:bottom w:type="dxa" w:w="60"/>
+              <w:right w:type="dxa" w:w="80"/>
+            </w:tcMar>
+          </w:tcPr>
+          <w:p>
+            <w:pPr>
+              <w:spacing w:line="276"/>
+            </w:pPr>
+            <w:r>
+              <w:rPr>
+                <w:rFonts w:ascii="Times New Roman" w:cs="Times New Roman" w:eastAsia="Times New Roman" w:hAnsi="Times New Roman"/>
+                <w:b w:val="false"/>
+                <w:bCs w:val="false"/>
+                <w:sz w:val="20"/>
+                <w:szCs w:val="20"/>
+              </w:rPr>
+              <w:t xml:space="preserve">0.8090</w:t>
             </w:r>
           </w:p>
         </w:tc>
@@ -4787,7 +5093,165 @@
       <w:tr>
         <w:tc>
           <w:tcPr>
-            <w:tcW w:type="dxa" w:w="1800"/>
+            <w:tcW w:type="dxa" w:w="1500"/>
+            <w:tcMar>
+              <w:top w:type="dxa" w:w="60"/>
+              <w:left w:type="dxa" w:w="80"/>
+              <w:bottom w:type="dxa" w:w="60"/>
+              <w:right w:type="dxa" w:w="80"/>
+            </w:tcMar>
+          </w:tcPr>
+          <w:p>
+            <w:pPr>
+              <w:spacing w:line="276"/>
+            </w:pPr>
+            <w:r>
+              <w:rPr>
+                <w:rFonts w:ascii="Times New Roman" w:cs="Times New Roman" w:eastAsia="Times New Roman" w:hAnsi="Times New Roman"/>
+                <w:b w:val="false"/>
+                <w:bCs w:val="false"/>
+                <w:sz w:val="20"/>
+                <w:szCs w:val="20"/>
+              </w:rPr>
+              <w:t xml:space="preserve">hybrid_advtrain</w:t>
+            </w:r>
+          </w:p>
+        </w:tc>
+        <w:tc>
+          <w:tcPr>
+            <w:tcW w:type="dxa" w:w="1500"/>
+            <w:tcMar>
+              <w:top w:type="dxa" w:w="60"/>
+              <w:left w:type="dxa" w:w="80"/>
+              <w:bottom w:type="dxa" w:w="60"/>
+              <w:right w:type="dxa" w:w="80"/>
+            </w:tcMar>
+          </w:tcPr>
+          <w:p>
+            <w:pPr>
+              <w:spacing w:line="276"/>
+            </w:pPr>
+            <w:r>
+              <w:rPr>
+                <w:rFonts w:ascii="Times New Roman" w:cs="Times New Roman" w:eastAsia="Times New Roman" w:hAnsi="Times New Roman"/>
+                <w:b w:val="false"/>
+                <w:bCs w:val="false"/>
+                <w:sz w:val="20"/>
+                <w:szCs w:val="20"/>
+              </w:rPr>
+              <w:t xml:space="preserve">0.7100</w:t>
+            </w:r>
+          </w:p>
+        </w:tc>
+        <w:tc>
+          <w:tcPr>
+            <w:tcW w:type="dxa" w:w="1500"/>
+            <w:tcMar>
+              <w:top w:type="dxa" w:w="60"/>
+              <w:left w:type="dxa" w:w="80"/>
+              <w:bottom w:type="dxa" w:w="60"/>
+              <w:right w:type="dxa" w:w="80"/>
+            </w:tcMar>
+          </w:tcPr>
+          <w:p>
+            <w:pPr>
+              <w:spacing w:line="276"/>
+            </w:pPr>
+            <w:r>
+              <w:rPr>
+                <w:rFonts w:ascii="Times New Roman" w:cs="Times New Roman" w:eastAsia="Times New Roman" w:hAnsi="Times New Roman"/>
+                <w:b w:val="false"/>
+                <w:bCs w:val="false"/>
+                <w:sz w:val="20"/>
+                <w:szCs w:val="20"/>
+              </w:rPr>
+              <w:t xml:space="preserve">0.6160</w:t>
+            </w:r>
+          </w:p>
+        </w:tc>
+        <w:tc>
+          <w:tcPr>
+            <w:tcW w:type="dxa" w:w="1500"/>
+            <w:tcMar>
+              <w:top w:type="dxa" w:w="60"/>
+              <w:left w:type="dxa" w:w="80"/>
+              <w:bottom w:type="dxa" w:w="60"/>
+              <w:right w:type="dxa" w:w="80"/>
+            </w:tcMar>
+          </w:tcPr>
+          <w:p>
+            <w:pPr>
+              <w:spacing w:line="276"/>
+            </w:pPr>
+            <w:r>
+              <w:rPr>
+                <w:rFonts w:ascii="Times New Roman" w:cs="Times New Roman" w:eastAsia="Times New Roman" w:hAnsi="Times New Roman"/>
+                <w:b w:val="false"/>
+                <w:bCs w:val="false"/>
+                <w:sz w:val="20"/>
+                <w:szCs w:val="20"/>
+              </w:rPr>
+              <w:t xml:space="preserve">0.9040</w:t>
+            </w:r>
+          </w:p>
+        </w:tc>
+        <w:tc>
+          <w:tcPr>
+            <w:tcW w:type="dxa" w:w="1500"/>
+            <w:tcMar>
+              <w:top w:type="dxa" w:w="60"/>
+              <w:left w:type="dxa" w:w="80"/>
+              <w:bottom w:type="dxa" w:w="60"/>
+              <w:right w:type="dxa" w:w="80"/>
+            </w:tcMar>
+          </w:tcPr>
+          <w:p>
+            <w:pPr>
+              <w:spacing w:line="276"/>
+            </w:pPr>
+            <w:r>
+              <w:rPr>
+                <w:rFonts w:ascii="Times New Roman" w:cs="Times New Roman" w:eastAsia="Times New Roman" w:hAnsi="Times New Roman"/>
+                <w:b w:val="false"/>
+                <w:bCs w:val="false"/>
+                <w:sz w:val="20"/>
+                <w:szCs w:val="20"/>
+              </w:rPr>
+              <w:t xml:space="preserve">0.9510</w:t>
+            </w:r>
+          </w:p>
+        </w:tc>
+        <w:tc>
+          <w:tcPr>
+            <w:tcW w:type="dxa" w:w="1500"/>
+            <w:tcMar>
+              <w:top w:type="dxa" w:w="60"/>
+              <w:left w:type="dxa" w:w="80"/>
+              <w:bottom w:type="dxa" w:w="60"/>
+              <w:right w:type="dxa" w:w="80"/>
+            </w:tcMar>
+          </w:tcPr>
+          <w:p>
+            <w:pPr>
+              <w:spacing w:line="276"/>
+            </w:pPr>
+            <w:r>
+              <w:rPr>
+                <w:rFonts w:ascii="Times New Roman" w:cs="Times New Roman" w:eastAsia="Times New Roman" w:hAnsi="Times New Roman"/>
+                <w:b w:val="false"/>
+                <w:bCs w:val="false"/>
+                <w:sz w:val="20"/>
+                <w:szCs w:val="20"/>
+              </w:rPr>
+              <w:t xml:space="preserve">0.9120</w:t>
+            </w:r>
+          </w:p>
+        </w:tc>
+      </w:tr>
+      <w:tr>
+        <w:tc>
+          <w:tcPr>
+            <w:tcW w:type="dxa" w:w="1500"/>
             <w:tcMar>
               <w:top w:type="dxa" w:w="60"/>
               <w:left w:type="dxa" w:w="80"/>
@@ -4813,105 +5277,131 @@
         </w:tc>
         <w:tc>
           <w:tcPr>
-            <w:tcW w:type="dxa" w:w="1800"/>
-            <w:tcMar>
-              <w:top w:type="dxa" w:w="60"/>
-              <w:left w:type="dxa" w:w="80"/>
-              <w:bottom w:type="dxa" w:w="60"/>
-              <w:right w:type="dxa" w:w="80"/>
-            </w:tcMar>
-          </w:tcPr>
-          <w:p>
-            <w:pPr>
-              <w:spacing w:line="276"/>
-            </w:pPr>
-            <w:r>
-              <w:rPr>
-                <w:rFonts w:ascii="Times New Roman" w:cs="Times New Roman" w:eastAsia="Times New Roman" w:hAnsi="Times New Roman"/>
-                <w:b w:val="false"/>
-                <w:bCs w:val="false"/>
-                <w:sz w:val="20"/>
-                <w:szCs w:val="20"/>
-              </w:rPr>
-              <w:t xml:space="preserve">0.9410</w:t>
-            </w:r>
-          </w:p>
-        </w:tc>
-        <w:tc>
-          <w:tcPr>
-            <w:tcW w:type="dxa" w:w="1800"/>
-            <w:tcMar>
-              <w:top w:type="dxa" w:w="60"/>
-              <w:left w:type="dxa" w:w="80"/>
-              <w:bottom w:type="dxa" w:w="60"/>
-              <w:right w:type="dxa" w:w="80"/>
-            </w:tcMar>
-          </w:tcPr>
-          <w:p>
-            <w:pPr>
-              <w:spacing w:line="276"/>
-            </w:pPr>
-            <w:r>
-              <w:rPr>
-                <w:rFonts w:ascii="Times New Roman" w:cs="Times New Roman" w:eastAsia="Times New Roman" w:hAnsi="Times New Roman"/>
-                <w:b w:val="false"/>
-                <w:bCs w:val="false"/>
-                <w:sz w:val="20"/>
-                <w:szCs w:val="20"/>
-              </w:rPr>
-              <w:t xml:space="preserve">0.8618</w:t>
-            </w:r>
-          </w:p>
-        </w:tc>
-        <w:tc>
-          <w:tcPr>
-            <w:tcW w:type="dxa" w:w="1800"/>
-            <w:tcMar>
-              <w:top w:type="dxa" w:w="60"/>
-              <w:left w:type="dxa" w:w="80"/>
-              <w:bottom w:type="dxa" w:w="60"/>
-              <w:right w:type="dxa" w:w="80"/>
-            </w:tcMar>
-          </w:tcPr>
-          <w:p>
-            <w:pPr>
-              <w:spacing w:line="276"/>
-            </w:pPr>
-            <w:r>
-              <w:rPr>
-                <w:rFonts w:ascii="Times New Roman" w:cs="Times New Roman" w:eastAsia="Times New Roman" w:hAnsi="Times New Roman"/>
-                <w:b w:val="false"/>
-                <w:bCs w:val="false"/>
-                <w:sz w:val="20"/>
-                <w:szCs w:val="20"/>
-              </w:rPr>
-              <w:t xml:space="preserve">0.9540</w:t>
-            </w:r>
-          </w:p>
-        </w:tc>
-        <w:tc>
-          <w:tcPr>
-            <w:tcW w:type="dxa" w:w="1800"/>
-            <w:tcMar>
-              <w:top w:type="dxa" w:w="60"/>
-              <w:left w:type="dxa" w:w="80"/>
-              <w:bottom w:type="dxa" w:w="60"/>
-              <w:right w:type="dxa" w:w="80"/>
-            </w:tcMar>
-          </w:tcPr>
-          <w:p>
-            <w:pPr>
-              <w:spacing w:line="276"/>
-            </w:pPr>
-            <w:r>
-              <w:rPr>
-                <w:rFonts w:ascii="Times New Roman" w:cs="Times New Roman" w:eastAsia="Times New Roman" w:hAnsi="Times New Roman"/>
-                <w:b w:val="false"/>
-                <w:bCs w:val="false"/>
-                <w:sz w:val="20"/>
-                <w:szCs w:val="20"/>
-              </w:rPr>
-              <w:t xml:space="preserve">0.5884</w:t>
+            <w:tcW w:type="dxa" w:w="1500"/>
+            <w:tcMar>
+              <w:top w:type="dxa" w:w="60"/>
+              <w:left w:type="dxa" w:w="80"/>
+              <w:bottom w:type="dxa" w:w="60"/>
+              <w:right w:type="dxa" w:w="80"/>
+            </w:tcMar>
+          </w:tcPr>
+          <w:p>
+            <w:pPr>
+              <w:spacing w:line="276"/>
+            </w:pPr>
+            <w:r>
+              <w:rPr>
+                <w:rFonts w:ascii="Times New Roman" w:cs="Times New Roman" w:eastAsia="Times New Roman" w:hAnsi="Times New Roman"/>
+                <w:b w:val="false"/>
+                <w:bCs w:val="false"/>
+                <w:sz w:val="20"/>
+                <w:szCs w:val="20"/>
+              </w:rPr>
+              <w:t xml:space="preserve">0.9430</w:t>
+            </w:r>
+          </w:p>
+        </w:tc>
+        <w:tc>
+          <w:tcPr>
+            <w:tcW w:type="dxa" w:w="1500"/>
+            <w:tcMar>
+              <w:top w:type="dxa" w:w="60"/>
+              <w:left w:type="dxa" w:w="80"/>
+              <w:bottom w:type="dxa" w:w="60"/>
+              <w:right w:type="dxa" w:w="80"/>
+            </w:tcMar>
+          </w:tcPr>
+          <w:p>
+            <w:pPr>
+              <w:spacing w:line="276"/>
+            </w:pPr>
+            <w:r>
+              <w:rPr>
+                <w:rFonts w:ascii="Times New Roman" w:cs="Times New Roman" w:eastAsia="Times New Roman" w:hAnsi="Times New Roman"/>
+                <w:b w:val="false"/>
+                <w:bCs w:val="false"/>
+                <w:sz w:val="20"/>
+                <w:szCs w:val="20"/>
+              </w:rPr>
+              <w:t xml:space="preserve">0.9230</w:t>
+            </w:r>
+          </w:p>
+        </w:tc>
+        <w:tc>
+          <w:tcPr>
+            <w:tcW w:type="dxa" w:w="1500"/>
+            <w:tcMar>
+              <w:top w:type="dxa" w:w="60"/>
+              <w:left w:type="dxa" w:w="80"/>
+              <w:bottom w:type="dxa" w:w="60"/>
+              <w:right w:type="dxa" w:w="80"/>
+            </w:tcMar>
+          </w:tcPr>
+          <w:p>
+            <w:pPr>
+              <w:spacing w:line="276"/>
+            </w:pPr>
+            <w:r>
+              <w:rPr>
+                <w:rFonts w:ascii="Times New Roman" w:cs="Times New Roman" w:eastAsia="Times New Roman" w:hAnsi="Times New Roman"/>
+                <w:b w:val="false"/>
+                <w:bCs w:val="false"/>
+                <w:sz w:val="20"/>
+                <w:szCs w:val="20"/>
+              </w:rPr>
+              <w:t xml:space="preserve">0.8670</w:t>
+            </w:r>
+          </w:p>
+        </w:tc>
+        <w:tc>
+          <w:tcPr>
+            <w:tcW w:type="dxa" w:w="1500"/>
+            <w:tcMar>
+              <w:top w:type="dxa" w:w="60"/>
+              <w:left w:type="dxa" w:w="80"/>
+              <w:bottom w:type="dxa" w:w="60"/>
+              <w:right w:type="dxa" w:w="80"/>
+            </w:tcMar>
+          </w:tcPr>
+          <w:p>
+            <w:pPr>
+              <w:spacing w:line="276"/>
+            </w:pPr>
+            <w:r>
+              <w:rPr>
+                <w:rFonts w:ascii="Times New Roman" w:cs="Times New Roman" w:eastAsia="Times New Roman" w:hAnsi="Times New Roman"/>
+                <w:b w:val="false"/>
+                <w:bCs w:val="false"/>
+                <w:sz w:val="20"/>
+                <w:szCs w:val="20"/>
+              </w:rPr>
+              <w:t xml:space="preserve">0.9610</w:t>
+            </w:r>
+          </w:p>
+        </w:tc>
+        <w:tc>
+          <w:tcPr>
+            <w:tcW w:type="dxa" w:w="1500"/>
+            <w:tcMar>
+              <w:top w:type="dxa" w:w="60"/>
+              <w:left w:type="dxa" w:w="80"/>
+              <w:bottom w:type="dxa" w:w="60"/>
+              <w:right w:type="dxa" w:w="80"/>
+            </w:tcMar>
+          </w:tcPr>
+          <w:p>
+            <w:pPr>
+              <w:spacing w:line="276"/>
+            </w:pPr>
+            <w:r>
+              <w:rPr>
+                <w:rFonts w:ascii="Times New Roman" w:cs="Times New Roman" w:eastAsia="Times New Roman" w:hAnsi="Times New Roman"/>
+                <w:b w:val="false"/>
+                <w:bCs w:val="false"/>
+                <w:sz w:val="20"/>
+                <w:szCs w:val="20"/>
+              </w:rPr>
+              <w:t xml:space="preserve">0.6010</w:t>
             </w:r>
           </w:p>
         </w:tc>

</xml_diff>